<commit_message>
refs #15784 - MAJ archétype pour corriger les anomalies de la 6.1.1
</commit_message>
<xml_diff>
--- a/af-archetype/src/main/resources/archetype-resources/__rootArtifactId__-backserver/src/main/resources/pdf/DemandeAccordee.docx
+++ b/af-archetype/src/main/resources/archetype-resources/__rootArtifactId__-backserver/src/main/resources/pdf/DemandeAccordee.docx
@@ -2,56 +2,497 @@
 <file path=word/document.xml><?xml version="1.0" encoding="utf-8"?>
 <w:document xmlns:wpc="http://schemas.microsoft.com/office/word/2010/wordprocessingCanvas" xmlns:cx="http://schemas.microsoft.com/office/drawing/2014/chartex" xmlns:cx1="http://schemas.microsoft.com/office/drawing/2015/9/8/chartex" xmlns:mc="http://schemas.openxmlformats.org/markup-compatibility/2006" xmlns:o="urn:schemas-microsoft-com:office:office" xmlns:r="http://schemas.openxmlformats.org/officeDocument/2006/relationships" xmlns:m="http://schemas.openxmlformats.org/officeDocument/2006/math" xmlns:v="urn:schemas-microsoft-com:vml" xmlns:wp14="http://schemas.microsoft.com/office/word/2010/wordprocessingDrawing" xmlns:wp="http://schemas.openxmlformats.org/drawingml/2006/wordprocessingDrawing" xmlns:w10="urn:schemas-microsoft-com:office:word" xmlns:w="http://schemas.openxmlformats.org/wordprocessingml/2006/main" xmlns:w14="http://schemas.microsoft.com/office/word/2010/wordml" xmlns:w15="http://schemas.microsoft.com/office/word/2012/wordml" xmlns:w16se="http://schemas.microsoft.com/office/word/2015/wordml/symex" xmlns:wpg="http://schemas.microsoft.com/office/word/2010/wordprocessingGroup" xmlns:wpi="http://schemas.microsoft.com/office/word/2010/wordprocessingInk" xmlns:wne="http://schemas.microsoft.com/office/word/2006/wordml" xmlns:wps="http://schemas.microsoft.com/office/word/2010/wordprocessingShape" mc:Ignorable="w14 w15 w16se wp14">
   <w:body>
-    <w:p>
-      <w:pPr>
-        <w:spacing w:after="200" w:line="276" w:lineRule="auto"/>
-        <w:ind w:left="4962" w:firstLine="1417"/>
-        <w:jc w:val="both"/>
-      </w:pPr>
-      <w:r>
-        <w:rPr>
-          <w:sz w:val="24"/>
-          <w:szCs w:val="24"/>
-        </w:rPr>
-        <w:t xml:space="preserve">Monaco, le </w:t>
-      </w:r>
-      <w:r>
-        <w:rPr>
-          <w:sz w:val="24"/>
-          <w:szCs w:val="24"/>
-        </w:rPr>
-        <w:fldChar w:fldCharType="begin"/>
-      </w:r>
-      <w:r>
-        <w:rPr>
-          <w:sz w:val="24"/>
-          <w:szCs w:val="24"/>
-        </w:rPr>
-        <w:instrText xml:space="preserve"> MERGEFIELD  $dateCourante  \* MERGEFORMAT </w:instrText>
-      </w:r>
-      <w:r>
-        <w:rPr>
-          <w:sz w:val="24"/>
-          <w:szCs w:val="24"/>
-        </w:rPr>
-        <w:fldChar w:fldCharType="separate"/>
-      </w:r>
-      <w:r>
-        <w:rPr>
-          <w:noProof/>
-          <w:sz w:val="24"/>
-          <w:szCs w:val="24"/>
-        </w:rPr>
-        <w:t>«$dateCourante»</w:t>
-      </w:r>
-      <w:r>
-        <w:rPr>
-          <w:sz w:val="24"/>
-          <w:szCs w:val="24"/>
-        </w:rPr>
-        <w:fldChar w:fldCharType="end"/>
-      </w:r>
-    </w:p>
+    <w:tbl>
+      <w:tblPr>
+        <w:tblStyle w:val="Grilledutableau"/>
+        <w:tblW w:w="0" w:type="auto"/>
+        <w:tblInd w:w="6374" w:type="dxa"/>
+        <w:tblBorders>
+          <w:top w:val="none" w:sz="0" w:space="0" w:color="auto"/>
+          <w:left w:val="none" w:sz="0" w:space="0" w:color="auto"/>
+          <w:bottom w:val="none" w:sz="0" w:space="0" w:color="auto"/>
+          <w:right w:val="none" w:sz="0" w:space="0" w:color="auto"/>
+          <w:insideH w:val="none" w:sz="0" w:space="0" w:color="auto"/>
+          <w:insideV w:val="none" w:sz="0" w:space="0" w:color="auto"/>
+        </w:tblBorders>
+        <w:tblLook w:val="04A0" w:firstRow="1" w:lastRow="0" w:firstColumn="1" w:lastColumn="0" w:noHBand="0" w:noVBand="1"/>
+      </w:tblPr>
+      <w:tblGrid>
+        <w:gridCol w:w="4952"/>
+      </w:tblGrid>
+      <w:tr>
+        <w:trPr>
+          <w:trHeight w:val="422"/>
+        </w:trPr>
+        <w:tc>
+          <w:tcPr>
+            <w:tcW w:w="4952" w:type="dxa"/>
+            <w:hideMark/>
+          </w:tcPr>
+          <w:p>
+            <w:pPr>
+              <w:spacing w:after="200" w:line="276" w:lineRule="auto"/>
+              <w:jc w:val="both"/>
+              <w:rPr>
+                <w:lang w:eastAsia="ja-JP"/>
+              </w:rPr>
+            </w:pPr>
+            <w:r>
+              <w:rPr>
+                <w:sz w:val="24"/>
+                <w:szCs w:val="24"/>
+                <w:lang w:eastAsia="ja-JP"/>
+              </w:rPr>
+              <w:t xml:space="preserve">Monaco, le </w:t>
+            </w:r>
+            <w:r>
+              <w:rPr>
+                <w:sz w:val="24"/>
+                <w:szCs w:val="24"/>
+                <w:lang w:eastAsia="ja-JP"/>
+              </w:rPr>
+              <w:fldChar w:fldCharType="begin"/>
+            </w:r>
+            <w:r>
+              <w:rPr>
+                <w:sz w:val="24"/>
+                <w:szCs w:val="24"/>
+                <w:lang w:eastAsia="ja-JP"/>
+              </w:rPr>
+              <w:instrText xml:space="preserve"> MERGEFIELD  $dateCourante  \* MERGEFORMAT </w:instrText>
+            </w:r>
+            <w:r>
+              <w:rPr>
+                <w:sz w:val="24"/>
+                <w:szCs w:val="24"/>
+                <w:lang w:eastAsia="ja-JP"/>
+              </w:rPr>
+              <w:fldChar w:fldCharType="separate"/>
+            </w:r>
+            <w:r>
+              <w:rPr>
+                <w:noProof/>
+                <w:sz w:val="24"/>
+                <w:szCs w:val="24"/>
+                <w:lang w:eastAsia="ja-JP"/>
+              </w:rPr>
+              <w:t>«$dateCourante»</w:t>
+            </w:r>
+            <w:r>
+              <w:rPr>
+                <w:sz w:val="24"/>
+                <w:szCs w:val="24"/>
+                <w:lang w:eastAsia="ja-JP"/>
+              </w:rPr>
+              <w:fldChar w:fldCharType="end"/>
+            </w:r>
+          </w:p>
+          <w:p>
+            <w:pPr>
+              <w:widowControl w:val="0"/>
+              <w:tabs>
+                <w:tab w:val="left" w:pos="5670"/>
+              </w:tabs>
+              <w:autoSpaceDE w:val="0"/>
+              <w:autoSpaceDN w:val="0"/>
+              <w:adjustRightInd w:val="0"/>
+              <w:ind w:right="1134"/>
+              <w:jc w:val="both"/>
+              <w:rPr>
+                <w:sz w:val="24"/>
+                <w:szCs w:val="24"/>
+                <w:lang w:eastAsia="ja-JP"/>
+              </w:rPr>
+            </w:pPr>
+            <w:r>
+              <w:rPr>
+                <w:sz w:val="24"/>
+                <w:szCs w:val="24"/>
+                <w:lang w:eastAsia="ja-JP"/>
+              </w:rPr>
+              <w:fldChar w:fldCharType="begin"/>
+            </w:r>
+            <w:r>
+              <w:rPr>
+                <w:sz w:val="24"/>
+                <w:szCs w:val="24"/>
+                <w:lang w:eastAsia="ja-JP"/>
+              </w:rPr>
+              <w:instrText xml:space="preserve"> MERGEFIELD  $raisonSociale  \* MERGEFORMAT </w:instrText>
+            </w:r>
+            <w:r>
+              <w:rPr>
+                <w:sz w:val="24"/>
+                <w:szCs w:val="24"/>
+                <w:lang w:eastAsia="ja-JP"/>
+              </w:rPr>
+              <w:fldChar w:fldCharType="separate"/>
+            </w:r>
+            <w:r>
+              <w:rPr>
+                <w:noProof/>
+                <w:sz w:val="24"/>
+                <w:szCs w:val="24"/>
+                <w:lang w:eastAsia="ja-JP"/>
+              </w:rPr>
+              <w:t>«$raisonSociale»</w:t>
+            </w:r>
+            <w:r>
+              <w:rPr>
+                <w:sz w:val="24"/>
+                <w:szCs w:val="24"/>
+                <w:lang w:eastAsia="ja-JP"/>
+              </w:rPr>
+              <w:fldChar w:fldCharType="end"/>
+            </w:r>
+          </w:p>
+          <w:p>
+            <w:pPr>
+              <w:widowControl w:val="0"/>
+              <w:tabs>
+                <w:tab w:val="left" w:pos="5670"/>
+              </w:tabs>
+              <w:autoSpaceDE w:val="0"/>
+              <w:autoSpaceDN w:val="0"/>
+              <w:adjustRightInd w:val="0"/>
+              <w:ind w:right="1134"/>
+              <w:jc w:val="both"/>
+              <w:rPr>
+                <w:sz w:val="24"/>
+                <w:szCs w:val="24"/>
+                <w:lang w:eastAsia="ja-JP"/>
+              </w:rPr>
+            </w:pPr>
+            <w:r>
+              <w:rPr>
+                <w:sz w:val="24"/>
+                <w:szCs w:val="24"/>
+                <w:lang w:eastAsia="ja-JP"/>
+              </w:rPr>
+              <w:fldChar w:fldCharType="begin"/>
+            </w:r>
+            <w:r>
+              <w:rPr>
+                <w:sz w:val="24"/>
+                <w:szCs w:val="24"/>
+                <w:lang w:eastAsia="ja-JP"/>
+              </w:rPr>
+              <w:instrText xml:space="preserve"> MERGEFIELD  $nomCompletUsager  \* MERGEFORMAT </w:instrText>
+            </w:r>
+            <w:r>
+              <w:rPr>
+                <w:sz w:val="24"/>
+                <w:szCs w:val="24"/>
+                <w:lang w:eastAsia="ja-JP"/>
+              </w:rPr>
+              <w:fldChar w:fldCharType="separate"/>
+            </w:r>
+            <w:r>
+              <w:rPr>
+                <w:noProof/>
+                <w:sz w:val="24"/>
+                <w:szCs w:val="24"/>
+                <w:lang w:eastAsia="ja-JP"/>
+              </w:rPr>
+              <w:t>«$nomCompletUsager»</w:t>
+            </w:r>
+            <w:r>
+              <w:rPr>
+                <w:sz w:val="24"/>
+                <w:szCs w:val="24"/>
+                <w:lang w:eastAsia="ja-JP"/>
+              </w:rPr>
+              <w:fldChar w:fldCharType="end"/>
+            </w:r>
+          </w:p>
+          <w:p>
+            <w:pPr>
+              <w:widowControl w:val="0"/>
+              <w:tabs>
+                <w:tab w:val="left" w:pos="5670"/>
+              </w:tabs>
+              <w:autoSpaceDE w:val="0"/>
+              <w:autoSpaceDN w:val="0"/>
+              <w:adjustRightInd w:val="0"/>
+              <w:ind w:right="1134"/>
+              <w:jc w:val="both"/>
+              <w:rPr>
+                <w:sz w:val="24"/>
+                <w:szCs w:val="24"/>
+                <w:lang w:eastAsia="ja-JP"/>
+              </w:rPr>
+            </w:pPr>
+            <w:r>
+              <w:rPr>
+                <w:sz w:val="24"/>
+                <w:szCs w:val="24"/>
+                <w:lang w:eastAsia="ja-JP"/>
+              </w:rPr>
+              <w:fldChar w:fldCharType="begin"/>
+            </w:r>
+            <w:r>
+              <w:rPr>
+                <w:sz w:val="24"/>
+                <w:szCs w:val="24"/>
+                <w:lang w:eastAsia="ja-JP"/>
+              </w:rPr>
+              <w:instrText xml:space="preserve"> MERGEFIELD  $adresseLigne1  \* MERGEFORMAT </w:instrText>
+            </w:r>
+            <w:r>
+              <w:rPr>
+                <w:sz w:val="24"/>
+                <w:szCs w:val="24"/>
+                <w:lang w:eastAsia="ja-JP"/>
+              </w:rPr>
+              <w:fldChar w:fldCharType="separate"/>
+            </w:r>
+            <w:r>
+              <w:rPr>
+                <w:noProof/>
+                <w:sz w:val="24"/>
+                <w:szCs w:val="24"/>
+                <w:lang w:eastAsia="ja-JP"/>
+              </w:rPr>
+              <w:t>«$adresseLigne1»</w:t>
+            </w:r>
+            <w:r>
+              <w:rPr>
+                <w:sz w:val="24"/>
+                <w:szCs w:val="24"/>
+                <w:lang w:eastAsia="ja-JP"/>
+              </w:rPr>
+              <w:fldChar w:fldCharType="end"/>
+            </w:r>
+          </w:p>
+          <w:p>
+            <w:pPr>
+              <w:widowControl w:val="0"/>
+              <w:tabs>
+                <w:tab w:val="left" w:pos="5670"/>
+              </w:tabs>
+              <w:autoSpaceDE w:val="0"/>
+              <w:autoSpaceDN w:val="0"/>
+              <w:adjustRightInd w:val="0"/>
+              <w:ind w:right="1134"/>
+              <w:jc w:val="both"/>
+              <w:rPr>
+                <w:sz w:val="24"/>
+                <w:szCs w:val="24"/>
+                <w:lang w:eastAsia="ja-JP"/>
+              </w:rPr>
+            </w:pPr>
+            <w:r>
+              <w:rPr>
+                <w:sz w:val="24"/>
+                <w:szCs w:val="24"/>
+                <w:lang w:eastAsia="ja-JP"/>
+              </w:rPr>
+              <w:fldChar w:fldCharType="begin"/>
+            </w:r>
+            <w:r>
+              <w:rPr>
+                <w:sz w:val="24"/>
+                <w:szCs w:val="24"/>
+                <w:lang w:eastAsia="ja-JP"/>
+              </w:rPr>
+              <w:instrText xml:space="preserve"> MERGEFIELD  $adresseLigne2  \* MERGEFORMAT </w:instrText>
+            </w:r>
+            <w:r>
+              <w:rPr>
+                <w:sz w:val="24"/>
+                <w:szCs w:val="24"/>
+                <w:lang w:eastAsia="ja-JP"/>
+              </w:rPr>
+              <w:fldChar w:fldCharType="separate"/>
+            </w:r>
+            <w:r>
+              <w:rPr>
+                <w:noProof/>
+                <w:sz w:val="24"/>
+                <w:szCs w:val="24"/>
+                <w:lang w:eastAsia="ja-JP"/>
+              </w:rPr>
+              <w:t>«$adresseLigne2»</w:t>
+            </w:r>
+            <w:r>
+              <w:rPr>
+                <w:sz w:val="24"/>
+                <w:szCs w:val="24"/>
+                <w:lang w:eastAsia="ja-JP"/>
+              </w:rPr>
+              <w:fldChar w:fldCharType="end"/>
+            </w:r>
+          </w:p>
+          <w:p>
+            <w:pPr>
+              <w:widowControl w:val="0"/>
+              <w:tabs>
+                <w:tab w:val="left" w:pos="5670"/>
+              </w:tabs>
+              <w:autoSpaceDE w:val="0"/>
+              <w:autoSpaceDN w:val="0"/>
+              <w:adjustRightInd w:val="0"/>
+              <w:ind w:right="1134"/>
+              <w:jc w:val="both"/>
+              <w:rPr>
+                <w:sz w:val="24"/>
+                <w:szCs w:val="24"/>
+                <w:lang w:eastAsia="ja-JP"/>
+              </w:rPr>
+            </w:pPr>
+            <w:r>
+              <w:rPr>
+                <w:sz w:val="24"/>
+                <w:szCs w:val="24"/>
+                <w:lang w:eastAsia="ja-JP"/>
+              </w:rPr>
+              <w:fldChar w:fldCharType="begin"/>
+            </w:r>
+            <w:r>
+              <w:rPr>
+                <w:sz w:val="24"/>
+                <w:szCs w:val="24"/>
+                <w:lang w:eastAsia="ja-JP"/>
+              </w:rPr>
+              <w:instrText xml:space="preserve"> MERGEFIELD  $adresseLigne3  \* MERGEFORMAT </w:instrText>
+            </w:r>
+            <w:r>
+              <w:rPr>
+                <w:sz w:val="24"/>
+                <w:szCs w:val="24"/>
+                <w:lang w:eastAsia="ja-JP"/>
+              </w:rPr>
+              <w:fldChar w:fldCharType="separate"/>
+            </w:r>
+            <w:r>
+              <w:rPr>
+                <w:noProof/>
+                <w:sz w:val="24"/>
+                <w:szCs w:val="24"/>
+                <w:lang w:eastAsia="ja-JP"/>
+              </w:rPr>
+              <w:t>«$adresseLigne3»</w:t>
+            </w:r>
+            <w:r>
+              <w:rPr>
+                <w:sz w:val="24"/>
+                <w:szCs w:val="24"/>
+                <w:lang w:eastAsia="ja-JP"/>
+              </w:rPr>
+              <w:fldChar w:fldCharType="end"/>
+            </w:r>
+          </w:p>
+          <w:p>
+            <w:pPr>
+              <w:widowControl w:val="0"/>
+              <w:tabs>
+                <w:tab w:val="left" w:pos="5670"/>
+              </w:tabs>
+              <w:autoSpaceDE w:val="0"/>
+              <w:autoSpaceDN w:val="0"/>
+              <w:adjustRightInd w:val="0"/>
+              <w:ind w:right="1134"/>
+              <w:jc w:val="both"/>
+              <w:rPr>
+                <w:sz w:val="24"/>
+                <w:szCs w:val="24"/>
+                <w:lang w:eastAsia="ja-JP"/>
+              </w:rPr>
+            </w:pPr>
+            <w:r>
+              <w:rPr>
+                <w:sz w:val="24"/>
+                <w:szCs w:val="24"/>
+                <w:lang w:eastAsia="ja-JP"/>
+              </w:rPr>
+              <w:fldChar w:fldCharType="begin"/>
+            </w:r>
+            <w:r>
+              <w:rPr>
+                <w:sz w:val="24"/>
+                <w:szCs w:val="24"/>
+                <w:lang w:eastAsia="ja-JP"/>
+              </w:rPr>
+              <w:instrText xml:space="preserve"> MERGEFIELD  $codePostal  \* MERGEFORMAT </w:instrText>
+            </w:r>
+            <w:r>
+              <w:rPr>
+                <w:sz w:val="24"/>
+                <w:szCs w:val="24"/>
+                <w:lang w:eastAsia="ja-JP"/>
+              </w:rPr>
+              <w:fldChar w:fldCharType="separate"/>
+            </w:r>
+            <w:r>
+              <w:rPr>
+                <w:noProof/>
+                <w:sz w:val="24"/>
+                <w:szCs w:val="24"/>
+                <w:lang w:eastAsia="ja-JP"/>
+              </w:rPr>
+              <w:t>«$codePostal»</w:t>
+            </w:r>
+            <w:r>
+              <w:rPr>
+                <w:sz w:val="24"/>
+                <w:szCs w:val="24"/>
+                <w:lang w:eastAsia="ja-JP"/>
+              </w:rPr>
+              <w:fldChar w:fldCharType="end"/>
+            </w:r>
+            <w:r>
+              <w:rPr>
+                <w:sz w:val="24"/>
+                <w:szCs w:val="24"/>
+                <w:lang w:eastAsia="ja-JP"/>
+              </w:rPr>
+              <w:t xml:space="preserve"> </w:t>
+            </w:r>
+            <w:r>
+              <w:rPr>
+                <w:sz w:val="24"/>
+                <w:szCs w:val="24"/>
+                <w:lang w:eastAsia="ja-JP"/>
+              </w:rPr>
+              <w:fldChar w:fldCharType="begin"/>
+            </w:r>
+            <w:r>
+              <w:rPr>
+                <w:sz w:val="24"/>
+                <w:szCs w:val="24"/>
+                <w:lang w:eastAsia="ja-JP"/>
+              </w:rPr>
+              <w:instrText xml:space="preserve"> MERGEFIELD  $ville  \* MERGEFORMAT </w:instrText>
+            </w:r>
+            <w:r>
+              <w:rPr>
+                <w:sz w:val="24"/>
+                <w:szCs w:val="24"/>
+                <w:lang w:eastAsia="ja-JP"/>
+              </w:rPr>
+              <w:fldChar w:fldCharType="separate"/>
+            </w:r>
+            <w:r>
+              <w:rPr>
+                <w:noProof/>
+                <w:sz w:val="24"/>
+                <w:szCs w:val="24"/>
+                <w:lang w:eastAsia="ja-JP"/>
+              </w:rPr>
+              <w:t>«$ville»</w:t>
+            </w:r>
+            <w:r>
+              <w:rPr>
+                <w:sz w:val="24"/>
+                <w:szCs w:val="24"/>
+                <w:lang w:eastAsia="ja-JP"/>
+              </w:rPr>
+              <w:fldChar w:fldCharType="end"/>
+            </w:r>
+          </w:p>
+        </w:tc>
+      </w:tr>
+    </w:tbl>
     <w:p>
       <w:pPr>
         <w:widowControl w:val="0"/>
@@ -68,453 +509,8 @@
           <w:szCs w:val="24"/>
         </w:rPr>
       </w:pPr>
-      <w:r>
-        <w:rPr>
-          <w:sz w:val="24"/>
-          <w:szCs w:val="24"/>
-        </w:rPr>
-        <w:fldChar w:fldCharType="begin"/>
-      </w:r>
-      <w:r>
-        <w:rPr>
-          <w:sz w:val="24"/>
-          <w:szCs w:val="24"/>
-        </w:rPr>
-        <w:instrText xml:space="preserve"> MERGEFIELD  $raisonSociale  \* MERGEFORMAT </w:instrText>
-      </w:r>
-      <w:r>
-        <w:rPr>
-          <w:sz w:val="24"/>
-          <w:szCs w:val="24"/>
-        </w:rPr>
-        <w:fldChar w:fldCharType="separate"/>
-      </w:r>
-      <w:r>
-        <w:rPr>
-          <w:noProof/>
-          <w:sz w:val="24"/>
-          <w:szCs w:val="24"/>
-        </w:rPr>
-        <w:t>«$raisonSociale»</w:t>
-      </w:r>
-      <w:r>
-        <w:rPr>
-          <w:sz w:val="24"/>
-          <w:szCs w:val="24"/>
-        </w:rPr>
-        <w:fldChar w:fldCharType="end"/>
-      </w:r>
-    </w:p>
-    <w:p>
-      <w:pPr>
-        <w:widowControl w:val="0"/>
-        <w:tabs>
-          <w:tab w:val="left" w:pos="5670"/>
-        </w:tabs>
-        <w:autoSpaceDE w:val="0"/>
-        <w:autoSpaceDN w:val="0"/>
-        <w:adjustRightInd w:val="0"/>
-        <w:ind w:left="4962" w:right="1134" w:firstLine="1417"/>
-        <w:jc w:val="both"/>
-        <w:rPr>
-          <w:sz w:val="24"/>
-          <w:szCs w:val="24"/>
-        </w:rPr>
-      </w:pPr>
-      <w:r>
-        <w:rPr>
-          <w:sz w:val="24"/>
-          <w:szCs w:val="24"/>
-        </w:rPr>
-        <w:fldChar w:fldCharType="begin"/>
-      </w:r>
-      <w:r>
-        <w:rPr>
-          <w:sz w:val="24"/>
-          <w:szCs w:val="24"/>
-        </w:rPr>
-        <w:instrText xml:space="preserve"> MERGEFIELD  $titre  \* MERGEFORMAT </w:instrText>
-      </w:r>
-      <w:r>
-        <w:rPr>
-          <w:sz w:val="24"/>
-          <w:szCs w:val="24"/>
-        </w:rPr>
-        <w:fldChar w:fldCharType="separate"/>
-      </w:r>
-      <w:r>
-        <w:rPr>
-          <w:noProof/>
-          <w:sz w:val="24"/>
-          <w:szCs w:val="24"/>
-        </w:rPr>
-        <w:t>«$titre»</w:t>
-      </w:r>
-      <w:r>
-        <w:rPr>
-          <w:sz w:val="24"/>
-          <w:szCs w:val="24"/>
-        </w:rPr>
-        <w:fldChar w:fldCharType="end"/>
-      </w:r>
-      <w:r>
-        <w:rPr>
-          <w:sz w:val="24"/>
-          <w:szCs w:val="24"/>
-        </w:rPr>
-        <w:t xml:space="preserve"> </w:t>
-      </w:r>
-      <w:r>
-        <w:rPr>
-          <w:sz w:val="24"/>
-          <w:szCs w:val="24"/>
-        </w:rPr>
-        <w:fldChar w:fldCharType="begin"/>
-      </w:r>
-      <w:r>
-        <w:rPr>
-          <w:sz w:val="24"/>
-          <w:szCs w:val="24"/>
-        </w:rPr>
-        <w:instrText xml:space="preserve"> MERGEFIELD  $prenom  \* MERGEFORMAT </w:instrText>
-      </w:r>
-      <w:r>
-        <w:rPr>
-          <w:sz w:val="24"/>
-          <w:szCs w:val="24"/>
-        </w:rPr>
-        <w:fldChar w:fldCharType="separate"/>
-      </w:r>
-      <w:r>
-        <w:rPr>
-          <w:noProof/>
-          <w:sz w:val="24"/>
-          <w:szCs w:val="24"/>
-        </w:rPr>
-        <w:t>«$prenom»</w:t>
-      </w:r>
-      <w:r>
-        <w:rPr>
-          <w:sz w:val="24"/>
-          <w:szCs w:val="24"/>
-        </w:rPr>
-        <w:fldChar w:fldCharType="end"/>
-      </w:r>
-      <w:r>
-        <w:rPr>
-          <w:sz w:val="24"/>
-          <w:szCs w:val="24"/>
-        </w:rPr>
-        <w:t xml:space="preserve"> </w:t>
-      </w:r>
-      <w:r>
-        <w:rPr>
-          <w:sz w:val="24"/>
-          <w:szCs w:val="24"/>
-        </w:rPr>
-        <w:fldChar w:fldCharType="begin"/>
-      </w:r>
-      <w:r>
-        <w:rPr>
-          <w:sz w:val="24"/>
-          <w:szCs w:val="24"/>
-        </w:rPr>
-        <w:instrText xml:space="preserve"> MERGEFIELD  $nom  \* MERGEFORMAT </w:instrText>
-      </w:r>
-      <w:r>
-        <w:rPr>
-          <w:sz w:val="24"/>
-          <w:szCs w:val="24"/>
-        </w:rPr>
-        <w:fldChar w:fldCharType="separate"/>
-      </w:r>
-      <w:r>
-        <w:rPr>
-          <w:noProof/>
-          <w:sz w:val="24"/>
-          <w:szCs w:val="24"/>
-        </w:rPr>
-        <w:t>«$nom»</w:t>
-      </w:r>
-      <w:r>
-        <w:rPr>
-          <w:sz w:val="24"/>
-          <w:szCs w:val="24"/>
-        </w:rPr>
-        <w:fldChar w:fldCharType="end"/>
-      </w:r>
-    </w:p>
-    <w:p>
-      <w:pPr>
-        <w:widowControl w:val="0"/>
-        <w:tabs>
-          <w:tab w:val="left" w:pos="5670"/>
-        </w:tabs>
-        <w:autoSpaceDE w:val="0"/>
-        <w:autoSpaceDN w:val="0"/>
-        <w:adjustRightInd w:val="0"/>
-        <w:ind w:left="4962" w:right="1134" w:firstLine="1417"/>
-        <w:jc w:val="both"/>
-        <w:rPr>
-          <w:sz w:val="24"/>
-          <w:szCs w:val="24"/>
-        </w:rPr>
-      </w:pPr>
-      <w:r>
-        <w:rPr>
-          <w:sz w:val="24"/>
-          <w:szCs w:val="24"/>
-        </w:rPr>
-        <w:fldChar w:fldCharType="begin"/>
-      </w:r>
-      <w:r>
-        <w:rPr>
-          <w:sz w:val="24"/>
-          <w:szCs w:val="24"/>
-        </w:rPr>
-        <w:instrText xml:space="preserve"> MERGEFIELD  $adresseLigne1  \* MERGEFORMAT </w:instrText>
-      </w:r>
-      <w:r>
-        <w:rPr>
-          <w:sz w:val="24"/>
-          <w:szCs w:val="24"/>
-        </w:rPr>
-        <w:fldChar w:fldCharType="separate"/>
-      </w:r>
-      <w:r>
-        <w:rPr>
-          <w:noProof/>
-          <w:sz w:val="24"/>
-          <w:szCs w:val="24"/>
-        </w:rPr>
-        <w:t>«$adresseLigne1»</w:t>
-      </w:r>
-      <w:r>
-        <w:rPr>
-          <w:sz w:val="24"/>
-          <w:szCs w:val="24"/>
-        </w:rPr>
-        <w:fldChar w:fldCharType="end"/>
-      </w:r>
-    </w:p>
-    <w:p>
-      <w:pPr>
-        <w:widowControl w:val="0"/>
-        <w:tabs>
-          <w:tab w:val="left" w:pos="5670"/>
-        </w:tabs>
-        <w:autoSpaceDE w:val="0"/>
-        <w:autoSpaceDN w:val="0"/>
-        <w:adjustRightInd w:val="0"/>
-        <w:ind w:left="4962" w:right="1134" w:firstLine="1417"/>
-        <w:jc w:val="both"/>
-        <w:rPr>
-          <w:sz w:val="24"/>
-          <w:szCs w:val="24"/>
-        </w:rPr>
-      </w:pPr>
-      <w:r>
-        <w:rPr>
-          <w:sz w:val="24"/>
-          <w:szCs w:val="24"/>
-        </w:rPr>
-        <w:fldChar w:fldCharType="begin"/>
-      </w:r>
-      <w:r>
-        <w:rPr>
-          <w:sz w:val="24"/>
-          <w:szCs w:val="24"/>
-        </w:rPr>
-        <w:instrText xml:space="preserve"> MERGEFIELD  $adresseLigne2  \* MERGEFORMAT </w:instrText>
-      </w:r>
-      <w:r>
-        <w:rPr>
-          <w:sz w:val="24"/>
-          <w:szCs w:val="24"/>
-        </w:rPr>
-        <w:fldChar w:fldCharType="separate"/>
-      </w:r>
-      <w:r>
-        <w:rPr>
-          <w:noProof/>
-          <w:sz w:val="24"/>
-          <w:szCs w:val="24"/>
-        </w:rPr>
-        <w:t>«$adresseLigne2»</w:t>
-      </w:r>
-      <w:r>
-        <w:rPr>
-          <w:sz w:val="24"/>
-          <w:szCs w:val="24"/>
-        </w:rPr>
-        <w:fldChar w:fldCharType="end"/>
-      </w:r>
-    </w:p>
-    <w:p>
-      <w:pPr>
-        <w:widowControl w:val="0"/>
-        <w:tabs>
-          <w:tab w:val="left" w:pos="5670"/>
-        </w:tabs>
-        <w:autoSpaceDE w:val="0"/>
-        <w:autoSpaceDN w:val="0"/>
-        <w:adjustRightInd w:val="0"/>
-        <w:ind w:left="4962" w:right="1134" w:firstLine="1417"/>
-        <w:jc w:val="both"/>
-        <w:rPr>
-          <w:sz w:val="24"/>
-          <w:szCs w:val="24"/>
-        </w:rPr>
-      </w:pPr>
-      <w:r>
-        <w:rPr>
-          <w:sz w:val="24"/>
-          <w:szCs w:val="24"/>
-        </w:rPr>
-        <w:fldChar w:fldCharType="begin"/>
-      </w:r>
-      <w:r>
-        <w:rPr>
-          <w:sz w:val="24"/>
-          <w:szCs w:val="24"/>
-        </w:rPr>
-        <w:instrText xml:space="preserve"> MERGEFIELD  $adresseLigne3  \* MERGEFORMAT </w:instrText>
-      </w:r>
-      <w:r>
-        <w:rPr>
-          <w:sz w:val="24"/>
-          <w:szCs w:val="24"/>
-        </w:rPr>
-        <w:fldChar w:fldCharType="separate"/>
-      </w:r>
-      <w:r>
-        <w:rPr>
-          <w:noProof/>
-          <w:sz w:val="24"/>
-          <w:szCs w:val="24"/>
-        </w:rPr>
-        <w:t>«$adresseLigne3»</w:t>
-      </w:r>
-      <w:r>
-        <w:rPr>
-          <w:sz w:val="24"/>
-          <w:szCs w:val="24"/>
-        </w:rPr>
-        <w:fldChar w:fldCharType="end"/>
-      </w:r>
-    </w:p>
-    <w:p>
-      <w:pPr>
-        <w:widowControl w:val="0"/>
-        <w:tabs>
-          <w:tab w:val="left" w:pos="5670"/>
-        </w:tabs>
-        <w:autoSpaceDE w:val="0"/>
-        <w:autoSpaceDN w:val="0"/>
-        <w:adjustRightInd w:val="0"/>
-        <w:ind w:left="4962" w:right="1134" w:firstLine="1417"/>
-        <w:jc w:val="both"/>
-        <w:rPr>
-          <w:sz w:val="24"/>
-          <w:szCs w:val="24"/>
-        </w:rPr>
-      </w:pPr>
-      <w:r>
-        <w:rPr>
-          <w:sz w:val="24"/>
-          <w:szCs w:val="24"/>
-        </w:rPr>
-        <w:fldChar w:fldCharType="begin"/>
-      </w:r>
-      <w:r>
-        <w:rPr>
-          <w:sz w:val="24"/>
-          <w:szCs w:val="24"/>
-        </w:rPr>
-        <w:instrText xml:space="preserve"> MERGEFIELD  $codePostal  \* MERGEFORMAT </w:instrText>
-      </w:r>
-      <w:r>
-        <w:rPr>
-          <w:sz w:val="24"/>
-          <w:szCs w:val="24"/>
-        </w:rPr>
-        <w:fldChar w:fldCharType="separate"/>
-      </w:r>
-      <w:r>
-        <w:rPr>
-          <w:noProof/>
-          <w:sz w:val="24"/>
-          <w:szCs w:val="24"/>
-        </w:rPr>
-        <w:t>«$codePostal»</w:t>
-      </w:r>
-      <w:r>
-        <w:rPr>
-          <w:sz w:val="24"/>
-          <w:szCs w:val="24"/>
-        </w:rPr>
-        <w:fldChar w:fldCharType="end"/>
-      </w:r>
-      <w:r>
-        <w:rPr>
-          <w:sz w:val="24"/>
-          <w:szCs w:val="24"/>
-        </w:rPr>
-        <w:t xml:space="preserve"> </w:t>
-      </w:r>
-      <w:r>
-        <w:rPr>
-          <w:sz w:val="24"/>
-          <w:szCs w:val="24"/>
-        </w:rPr>
-        <w:fldChar w:fldCharType="begin"/>
-      </w:r>
-      <w:r>
-        <w:rPr>
-          <w:sz w:val="24"/>
-          <w:szCs w:val="24"/>
-        </w:rPr>
-        <w:instrText xml:space="preserve"> MERGEFIELD  $ville  \* MERGEFORMAT </w:instrText>
-      </w:r>
-      <w:r>
-        <w:rPr>
-          <w:sz w:val="24"/>
-          <w:szCs w:val="24"/>
-        </w:rPr>
-        <w:fldChar w:fldCharType="separate"/>
-      </w:r>
-      <w:r>
-        <w:rPr>
-          <w:noProof/>
-          <w:sz w:val="24"/>
-          <w:szCs w:val="24"/>
-        </w:rPr>
-        <w:t>«$ville»</w:t>
-      </w:r>
-      <w:r>
-        <w:rPr>
-          <w:sz w:val="24"/>
-          <w:szCs w:val="24"/>
-        </w:rPr>
-        <w:fldChar w:fldCharType="end"/>
-      </w:r>
-    </w:p>
-    <w:p>
-      <w:pPr>
-        <w:widowControl w:val="0"/>
-        <w:tabs>
-          <w:tab w:val="left" w:pos="5670"/>
-        </w:tabs>
-        <w:autoSpaceDE w:val="0"/>
-        <w:autoSpaceDN w:val="0"/>
-        <w:adjustRightInd w:val="0"/>
-        <w:ind w:left="4962" w:right="1134" w:firstLine="1417"/>
-        <w:jc w:val="both"/>
-        <w:rPr>
-          <w:sz w:val="24"/>
-          <w:szCs w:val="24"/>
-        </w:rPr>
-      </w:pPr>
+      <w:bookmarkStart w:id="0" w:name="_GoBack"/>
+      <w:bookmarkEnd w:id="0"/>
     </w:p>
     <w:p>
       <w:pPr>
@@ -1214,8 +1210,6 @@
           </wp:inline>
         </w:drawing>
       </w:r>
-      <w:bookmarkStart w:id="0" w:name="_GoBack"/>
-      <w:bookmarkEnd w:id="0"/>
     </w:p>
     <w:sectPr>
       <w:headerReference w:type="first" r:id="rId8"/>
@@ -2420,6 +2414,23 @@
       <w:contextualSpacing/>
     </w:pPr>
   </w:style>
+  <w:style w:type="table" w:styleId="Grilledutableau">
+    <w:name w:val="Table Grid"/>
+    <w:basedOn w:val="TableauNormal"/>
+    <w:uiPriority w:val="59"/>
+    <w:rsid w:val="00DF340B"/>
+    <w:tblPr>
+      <w:tblInd w:w="0" w:type="nil"/>
+      <w:tblBorders>
+        <w:top w:val="single" w:sz="4" w:space="0" w:color="auto"/>
+        <w:left w:val="single" w:sz="4" w:space="0" w:color="auto"/>
+        <w:bottom w:val="single" w:sz="4" w:space="0" w:color="auto"/>
+        <w:right w:val="single" w:sz="4" w:space="0" w:color="auto"/>
+        <w:insideH w:val="single" w:sz="4" w:space="0" w:color="auto"/>
+        <w:insideV w:val="single" w:sz="4" w:space="0" w:color="auto"/>
+      </w:tblBorders>
+    </w:tblPr>
+  </w:style>
 </w:styles>
 </file>
 

</xml_diff>